<commit_message>
docs(infra): document the backend image across specs and roadmap
deployment §3.5, tech stack, tests §4.2 (.md + .docx); CLAUDE.md; DEVELOPMENT.md Step 3.4; Phase 3 complete.

Co-Authored-By: Claude Opus 5.5 <noreply@anthropic.com>
</commit_message>
<xml_diff>
--- a/docs/deployment.docx
+++ b/docs/deployment.docx
@@ -384,6 +384,117 @@
     <w:p>
       <w:r>
         <w:t>Written this way, the Phase 6 decision is a configuration change, not a rewrite.</w:t>
+      </w:r>
+    </w:p>
+    <w:p>
+      <w:pPr>
+        <w:pStyle w:val="Heading4"/>
+      </w:pPr>
+      <w:r>
+        <w:t xml:space="preserve">3.5. The backend image (built in Phase 3)</w:t>
+      </w:r>
+    </w:p>
+    <w:p>
+      <w:r>
+        <w:t xml:space="preserve">backend/Dockerfile is the deployment unit (Step 3.4, docs/features/backend-docker.md). What any host needs to know:</w:t>
+      </w:r>
+    </w:p>
+    <w:p>
+      <w:pPr>
+        <w:pStyle w:val="ListBullet"/>
+      </w:pPr>
+      <w:r>
+        <w:rPr>
+          <w:b/>
+        </w:rPr>
+        <w:t xml:space="preserve">Build:</w:t>
+      </w:r>
+      <w:r>
+        <w:t xml:space="preserve"> docker build -t bookrough-api backend. Base mcr.microsoft.com/playwright:v1.63.0-noble (Ubuntu 24.04, Node 24, Chromium pinned to our Playwright); a multi-stage build whose runtime stage holds production dependencies, dist/ and the Prisma migrations only.</w:t>
+      </w:r>
+    </w:p>
+    <w:p>
+      <w:pPr>
+        <w:pStyle w:val="ListBullet"/>
+      </w:pPr>
+      <w:r>
+        <w:rPr>
+          <w:b/>
+        </w:rPr>
+        <w:t xml:space="preserve">Run:</w:t>
+      </w:r>
+      <w:r>
+        <w:t xml:space="preserve"> set DATABASE_URL, JWT_SECRET, GOOGLE_CLIENT_ID, CORS_ORIGIN, and optionally PORT (default 4000) and LOG_LEVEL. NODE_ENV=production is baked in, so both E2E stand-ins are refused.</w:t>
+      </w:r>
+    </w:p>
+    <w:p>
+      <w:pPr>
+        <w:pStyle w:val="ListBullet"/>
+      </w:pPr>
+      <w:r>
+        <w:rPr>
+          <w:b/>
+        </w:rPr>
+        <w:t xml:space="preserve">Migrations run on start:</w:t>
+      </w:r>
+      <w:r>
+        <w:t xml:space="preserve"> prisma migrate deploy, then the API. A failed migration stops the container before it serves; concurrent starts are safe (Prisma's advisory lock).</w:t>
+      </w:r>
+    </w:p>
+    <w:p>
+      <w:pPr>
+        <w:pStyle w:val="ListBullet"/>
+      </w:pPr>
+      <w:r>
+        <w:rPr>
+          <w:b/>
+        </w:rPr>
+        <w:t xml:space="preserve">Process:</w:t>
+      </w:r>
+      <w:r>
+        <w:t xml:space="preserve"> runs as the non-root pwuser, with tini as PID 1 so SIGTERM reaches Node (graceful shutdown) and orphaned Chromium processes are reaped — no --init flag needed from the host. --disable-dev-shm-usage means --ipc=host is not needed either.</w:t>
+      </w:r>
+    </w:p>
+    <w:p>
+      <w:pPr>
+        <w:pStyle w:val="ListBullet"/>
+      </w:pPr>
+      <w:r>
+        <w:rPr>
+          <w:b/>
+        </w:rPr>
+        <w:t xml:space="preserve">Health:</w:t>
+      </w:r>
+      <w:r>
+        <w:t xml:space="preserve"> a Docker HEALTHCHECK on GET /api/health, which deliberately does not touch the database.</w:t>
+      </w:r>
+    </w:p>
+    <w:p>
+      <w:pPr>
+        <w:pStyle w:val="ListBullet"/>
+      </w:pPr>
+      <w:r>
+        <w:rPr>
+          <w:b/>
+        </w:rPr>
+        <w:t xml:space="preserve">Measured (Docker Desktop, 2026-10-05):</w:t>
+      </w:r>
+      <w:r>
+        <w:t xml:space="preserve"> image 2.85 GB (2.51 GB of it the base, which also carries unused Firefox and WebKit); about 83 MB of memory idle and about 234 MB at the peak of one real conversion. A 512 MB instance looks workable with p-limit(2); verify under load in Phase 6.</w:t>
+      </w:r>
+    </w:p>
+    <w:p>
+      <w:pPr>
+        <w:pStyle w:val="ListBullet"/>
+      </w:pPr>
+      <w:r>
+        <w:rPr>
+          <w:b/>
+        </w:rPr>
+        <w:t xml:space="preserve">CI:</w:t>
+      </w:r>
+      <w:r>
+        <w:t xml:space="preserve"> test:docker in main.yml builds the image and runs it against an empty Postgres after every merge and nightly (docs/tests.md §4.2).</w:t>
       </w:r>
     </w:p>
     <w:p>
@@ -1098,7 +1209,7 @@
         <w:pStyle w:val="ListBullet"/>
       </w:pPr>
       <w:r>
-        <w:t>[ ] Prisma migrations run against production.</w:t>
+        <w:t xml:space="preserve">[ ] Prisma migrations run against production — automatic: the container runs prisma migrate deploy on start (§3.5).</w:t>
       </w:r>
     </w:p>
     <w:p>

</xml_diff>

<commit_message>
docs(deploy): record vercel and neon as the production hosts
deployment, tech stack and development strategy updated in .md and
.docx; CLAUDE.md sections 2, 3 and 16; google-auth's one-site
constraint marked resolved.

Co-Authored-By: Claude Opus 5.5 <noreply@anthropic.com>
</commit_message>
<xml_diff>
--- a/docs/deployment.docx
+++ b/docs/deployment.docx
@@ -124,7 +124,7 @@
         <w:pStyle w:val="Heading3"/>
       </w:pPr>
       <w:r>
-        <w:t>3. Provider selection — deliberately deferred to Phase 6</w:t>
+        <w:t>3. Provider selection — decided 2026-10-10</w:t>
       </w:r>
     </w:p>
     <w:p>
@@ -132,12 +132,15 @@
         <w:rPr>
           <w:b/>
         </w:rPr>
-        <w:t>No hosting provider has been chosen, and one will not be chosen until Phase 6 is reached.</w:t>
+        <w:t>Chosen on 2026-10-10: Vercel (Hobby) for the frontend and the API, Neon (Free) for Postgres, both in Frankfurt, with Google Cloud Run as the agreed fallback.</w:t>
+      </w:r>
+      <w:r>
+        <w:t xml:space="preserve"> The decision is summarised in §3.6; the measurements, every candidate's terms on that date and the sources are in docs/features/production-deploy.md §3.1.</w:t>
       </w:r>
     </w:p>
     <w:p>
       <w:r>
-        <w:t>This is a deliberate decision, not an oversight. Free-tier terms change frequently — memory allowances, idle-spin-down behaviour, and especially the lifetime of free managed databases. Committing now to terms that may not hold months from now would mean planning against stale facts. The comparison below records the shape of the decision; the actual terms must be re-verified against each provider's current pricing page at the moment the decision is made.</w:t>
+        <w:t>The choice was deferred to Phase 6 on purpose: free-tier terms change frequently — memory allowances, idle spin-down, and especially the lifetime of free managed databases — so they were verified at the moment of deciding rather than months earlier. §3.1–§3.4 record how the decision was framed beforehand.</w:t>
       </w:r>
     </w:p>
     <w:p>
@@ -313,7 +316,7 @@
         <w:pStyle w:val="Heading4"/>
       </w:pPr>
       <w:r>
-        <w:t>3.4. Rule until Phase 6</w:t>
+        <w:t>3.4. Provider-agnostic code (still the rule)</w:t>
       </w:r>
     </w:p>
     <w:p>
@@ -383,7 +386,7 @@
     </w:p>
     <w:p>
       <w:r>
-        <w:t>Written this way, the Phase 6 decision is a configuration change, not a rewrite.</w:t>
+        <w:t>Written this way, the Phase 6 decision was a configuration change, not a rewrite — and moving to the fallback still is.</w:t>
       </w:r>
     </w:p>
     <w:p>
@@ -495,6 +498,126 @@
       </w:r>
       <w:r>
         <w:t xml:space="preserve"> test:docker in main.yml builds the image and runs it against an empty Postgres after every merge and nightly (docs/tests.md §4.2).</w:t>
+      </w:r>
+    </w:p>
+    <w:p>
+      <w:pPr>
+        <w:pStyle w:val="ListBullet"/>
+      </w:pPr>
+      <w:r>
+        <w:rPr>
+          <w:b/>
+        </w:rPr>
+        <w:t>On Vercel:</w:t>
+      </w:r>
+      <w:r>
+        <w:t xml:space="preserve"> the Container Runtime builds this Dockerfile unchanged, as the api service in vercel.json. PORT=4000 is set at the host because the runtime's default is 80; the HEALTHCHECK is ignored there and stays for other hosts and test:docker. Each deployment's image is kept in Vercel's Container Registry.</w:t>
+      </w:r>
+    </w:p>
+    <w:p>
+      <w:pPr>
+        <w:pStyle w:val="Heading4"/>
+      </w:pPr>
+      <w:r>
+        <w:t>3.6. The decision (2026-10-10)</w:t>
+      </w:r>
+    </w:p>
+    <w:p>
+      <w:pPr>
+        <w:pStyle w:val="ListBullet"/>
+      </w:pPr>
+      <w:r>
+        <w:rPr>
+          <w:b/>
+        </w:rPr>
+        <w:t>CPU decided it.</w:t>
+      </w:r>
+      <w:r>
+        <w:t xml:space="preserve"> The production image was timed under each candidate's CPU cap: at 0.1 CPU (Render Free, Koyeb Free) every conversion timed out; at 1 vCPU one conversion took about 3 s and two at once about 7 s.</w:t>
+      </w:r>
+    </w:p>
+    <w:p>
+      <w:pPr>
+        <w:pStyle w:val="ListBullet"/>
+      </w:pPr>
+      <w:r>
+        <w:rPr>
+          <w:b/>
+        </w:rPr>
+        <w:t>Vercel Hobby:</w:t>
+      </w:r>
+      <w:r>
+        <w:t xml:space="preserve"> $0 with no card; 2 GB / 1 vCPU; scales to zero after 5 minutes; 4 hours of active CPU and 360 GB-hours of provisioned memory a month; over quota the project pauses rather than bills. The Container Runtime and Services are Beta. Region fra1.</w:t>
+      </w:r>
+    </w:p>
+    <w:p>
+      <w:pPr>
+        <w:pStyle w:val="ListBullet"/>
+      </w:pPr>
+      <w:r>
+        <w:rPr>
+          <w:b/>
+        </w:rPr>
+        <w:t>One origin:</w:t>
+      </w:r>
+      <w:r>
+        <w:t xml:space="preserve"> https://bookrough.vercel.app — /api/* to the container, everything else to the Vite build (vercel.json). The SameSite=Lax cookie needs no change and CORS is not exercised. *.vercel.app is on the Public Suffix List, so a split api. / web. layout would have broken the cookie.</w:t>
+      </w:r>
+    </w:p>
+    <w:p>
+      <w:pPr>
+        <w:pStyle w:val="ListBullet"/>
+      </w:pPr>
+      <w:r>
+        <w:rPr>
+          <w:b/>
+        </w:rPr>
+        <w:t>Neon Free:</w:t>
+      </w:r>
+      <w:r>
+        <w:t xml:space="preserve"> permanent, no card, Postgres 16 in AWS eu-central-1; branch main for production, branch preview for preview deployments.</w:t>
+      </w:r>
+    </w:p>
+    <w:p>
+      <w:pPr>
+        <w:pStyle w:val="ListBullet"/>
+      </w:pPr>
+      <w:r>
+        <w:rPr>
+          <w:b/>
+        </w:rPr>
+        <w:t>Deploys:</w:t>
+      </w:r>
+      <w:r>
+        <w:t xml:space="preserve"> Vercel's GitHub integration — main to production, other branches to previews. Phase 6's hardening step makes production wait for test:e2e and test:docker (Vercel Deployment Checks).</w:t>
+      </w:r>
+    </w:p>
+    <w:p>
+      <w:pPr>
+        <w:pStyle w:val="ListBullet"/>
+      </w:pPr>
+      <w:r>
+        <w:rPr>
+          <w:b/>
+        </w:rPr>
+        <w:t>Measured in production (2026-10-11):</w:t>
+      </w:r>
+      <w:r>
+        <w:t xml:space="preserve"> a real Spotify → Apple Music conversion in 5.3 s.</w:t>
+      </w:r>
+    </w:p>
+    <w:p>
+      <w:pPr>
+        <w:pStyle w:val="ListBullet"/>
+      </w:pPr>
+      <w:r>
+        <w:rPr>
+          <w:b/>
+        </w:rPr>
+        <w:t>Rejected:</w:t>
+      </w:r>
+      <w:r>
+        <w:t xml:space="preserve"> Render Free and Koyeb Free (0.1 CPU), Render Starter ($7 a month), Fly.io and Railway (no ongoing free tier), Netlify (no containers); the free databases of Render (deleted after 30 days) and Supabase (paused after 7 idle days).</w:t>
       </w:r>
     </w:p>
     <w:p>
@@ -698,9 +821,8 @@
             <w:tcW w:type="dxa" w:w="2880"/>
           </w:tcPr>
           <w:p>
-            <w:r/>
             <w:r>
-              <w:t>Managed Postgres at the chosen provider</w:t>
+              <w:t>Neon Free, Frankfurt, branch main (preview deployments: branch preview)</w:t>
             </w:r>
           </w:p>
         </w:tc>
@@ -808,7 +930,24 @@
         <w:pStyle w:val="ListBullet"/>
       </w:pPr>
       <w:r>
-        <w:t>The Google OAuth client must list the production origin in its authorised JavaScript origins and redirect URIs; this is a manual step in the Google Cloud Console at deploy time and is easy to forget.</w:t>
+        <w:t xml:space="preserve">The Google OAuth client must list the production origin (https://bookrough.vercel.app) under </w:t>
+      </w:r>
+      <w:r>
+        <w:rPr>
+          <w:b/>
+        </w:rPr>
+        <w:t>Authorized JavaScript origins</w:t>
+      </w:r>
+      <w:r>
+        <w:t xml:space="preserve"> — not under redirect URIs, which this sign-in flow does not use; an origin entered there instead produces origin_mismatch. This is a manual step in the Google Cloud Console and is easy to get wrong.</w:t>
+      </w:r>
+    </w:p>
+    <w:p>
+      <w:pPr>
+        <w:pStyle w:val="ListBullet"/>
+      </w:pPr>
+      <w:r>
+        <w:t>Production variables are set in Vercel per environment: DATABASE_URL and JWT_SECRET (secrets, different for Production and Preview), GOOGLE_CLIENT_ID, VITE_GOOGLE_CLIENT_ID, CORS_ORIGIN, PORT=4000, LOG_LEVEL=info (lowercase). Never E2E_GOOGLE_PUBLIC_KEY or E2E_SCRAPER_FIXTURES. The full table is in docs/features/production-deploy.md §3.6.</w:t>
       </w:r>
     </w:p>
     <w:p>
@@ -1182,7 +1321,7 @@
         <w:pStyle w:val="ListBullet"/>
       </w:pPr>
       <w:r>
-        <w:t>[ ] Provider chosen, with current free-tier terms verified and recorded in this document.</w:t>
+        <w:t>[x] Provider chosen, with current free-tier terms verified and recorded in this document (§3.6, 2026-10-10).</w:t>
       </w:r>
     </w:p>
     <w:p>
@@ -1190,18 +1329,7 @@
         <w:pStyle w:val="ListBullet"/>
       </w:pPr>
       <w:r>
-        <w:t xml:space="preserve">[ ] Production Postgres provisioned; </w:t>
-      </w:r>
-      <w:r>
-        <w:rPr>
-          <w:rFonts w:ascii="Consolas" w:hAnsi="Consolas"/>
-          <w:color w:val="A03030"/>
-          <w:sz w:val="19"/>
-        </w:rPr>
-        <w:t>DATABASE_URL</w:t>
-      </w:r>
-      <w:r>
-        <w:t xml:space="preserve"> set as a secret.</w:t>
+        <w:t>[x] Production Postgres provisioned; DATABASE_URL set as a secret.</w:t>
       </w:r>
     </w:p>
     <w:p>
@@ -1209,7 +1337,7 @@
         <w:pStyle w:val="ListBullet"/>
       </w:pPr>
       <w:r>
-        <w:t xml:space="preserve">[ ] Prisma migrations run against production — automatic: the container runs prisma migrate deploy on start (§3.5).</w:t>
+        <w:t>[x] Prisma migrations run against production — automatic: the container runs prisma migrate deploy on start (§3.5).</w:t>
       </w:r>
     </w:p>
     <w:p>
@@ -1217,18 +1345,7 @@
         <w:pStyle w:val="ListBullet"/>
       </w:pPr>
       <w:r>
-        <w:t xml:space="preserve">[ ] </w:t>
-      </w:r>
-      <w:r>
-        <w:rPr>
-          <w:rFonts w:ascii="Consolas" w:hAnsi="Consolas"/>
-          <w:color w:val="A03030"/>
-          <w:sz w:val="19"/>
-        </w:rPr>
-        <w:t>JWT_SECRET</w:t>
-      </w:r>
-      <w:r>
-        <w:t xml:space="preserve"> independently generated and set.</w:t>
+        <w:t>[x] JWT_SECRET independently generated and set.</w:t>
       </w:r>
     </w:p>
     <w:p>
@@ -1236,7 +1353,7 @@
         <w:pStyle w:val="ListBullet"/>
       </w:pPr>
       <w:r>
-        <w:t>[ ] Google OAuth client updated with the production origin and redirect URI.</w:t>
+        <w:t>[x] Google OAuth client updated with the production origin (JavaScript origins only, §5).</w:t>
       </w:r>
     </w:p>
     <w:p>
@@ -1244,18 +1361,7 @@
         <w:pStyle w:val="ListBullet"/>
       </w:pPr>
       <w:r>
-        <w:t xml:space="preserve">[ ] Backend deployed from the Playwright-based Docker image; </w:t>
-      </w:r>
-      <w:r>
-        <w:rPr>
-          <w:rFonts w:ascii="Consolas" w:hAnsi="Consolas"/>
-          <w:color w:val="A03030"/>
-          <w:sz w:val="19"/>
-        </w:rPr>
-        <w:t>/api/health</w:t>
-      </w:r>
-      <w:r>
-        <w:t xml:space="preserve"> returns 200 over HTTPS.</w:t>
+        <w:t>[x] Backend deployed from the Playwright-based Docker image; /api/health returns 200 over HTTPS.</w:t>
       </w:r>
     </w:p>
     <w:p>
@@ -1263,18 +1369,7 @@
         <w:pStyle w:val="ListBullet"/>
       </w:pPr>
       <w:r>
-        <w:t xml:space="preserve">[ ] Frontend built with the production </w:t>
-      </w:r>
-      <w:r>
-        <w:rPr>
-          <w:rFonts w:ascii="Consolas" w:hAnsi="Consolas"/>
-          <w:color w:val="A03030"/>
-          <w:sz w:val="19"/>
-        </w:rPr>
-        <w:t>VITE_API_BASE_URL</w:t>
-      </w:r>
-      <w:r>
-        <w:t xml:space="preserve"> and deployed.</w:t>
+        <w:t>[x] Frontend built and deployed on the same origin; production builds default the API base URL to /api.</w:t>
       </w:r>
     </w:p>
     <w:p>
@@ -1282,7 +1377,7 @@
         <w:pStyle w:val="ListBullet"/>
       </w:pPr>
       <w:r>
-        <w:t>[ ] CORS configured to allow exactly the production frontend origin — not a wildcard.</w:t>
+        <w:t>[x] CORS configured to allow exactly the production origin — not a wildcard (unused in practice: every call is same-origin).</w:t>
       </w:r>
     </w:p>
     <w:p>
@@ -1331,7 +1426,7 @@
         <w:pStyle w:val="ListBullet"/>
       </w:pPr>
       <w:r>
-        <w:t>[ ] Link conversion verified end-to-end in production — this is the step most likely to fail, because Chromium's memory footprint on a small instance is not reproducible locally.</w:t>
+        <w:t>[x] Link conversion verified end-to-end in production — the step most likely to fail; it converted in 5.3 s on 2026-10-11.</w:t>
       </w:r>
     </w:p>
     <w:p>

</xml_diff>

<commit_message>
fix(deploy): read vercel.json without node types, allow blank log level
The routing test imported node:fs, which the frontend has no types
for: CI's typecheck and Vercel's build failed. A blank LOG_LEVEL now
means the default. Findings of /code-review max recorded.

Co-Authored-By: Claude Opus 5.5 <noreply@anthropic.com>
</commit_message>
<xml_diff>
--- a/docs/deployment.docx
+++ b/docs/deployment.docx
@@ -1385,40 +1385,7 @@
         <w:pStyle w:val="ListBullet"/>
       </w:pPr>
       <w:r>
-        <w:t xml:space="preserve">[ ] Auth cookie verified as </w:t>
-      </w:r>
-      <w:r>
-        <w:rPr>
-          <w:rFonts w:ascii="Consolas" w:hAnsi="Consolas"/>
-          <w:color w:val="A03030"/>
-          <w:sz w:val="19"/>
-        </w:rPr>
-        <w:t>HttpOnly</w:t>
-      </w:r>
-      <w:r>
-        <w:t xml:space="preserve">, </w:t>
-      </w:r>
-      <w:r>
-        <w:rPr>
-          <w:rFonts w:ascii="Consolas" w:hAnsi="Consolas"/>
-          <w:color w:val="A03030"/>
-          <w:sz w:val="19"/>
-        </w:rPr>
-        <w:t>Secure</w:t>
-      </w:r>
-      <w:r>
-        <w:t xml:space="preserve">, and </w:t>
-      </w:r>
-      <w:r>
-        <w:rPr>
-          <w:rFonts w:ascii="Consolas" w:hAnsi="Consolas"/>
-          <w:color w:val="A03030"/>
-          <w:sz w:val="19"/>
-        </w:rPr>
-        <w:t>SameSite</w:t>
-      </w:r>
-      <w:r>
-        <w:t>=Lax, which requires the frontend and the API on the same site (one registrable domain, or the API proxied under the frontend origin). See docs/features/google-auth.md §4.</w:t>
+        <w:t>[x] Auth cookie verified as HttpOnly, Secure, and SameSite=Lax in production (2026-10-11) — possible because the frontend and the API share one origin (§3.6). See docs/features/google-auth.md §4.</w:t>
       </w:r>
     </w:p>
     <w:p>

</xml_diff>

<commit_message>
chore(deploy): production deploy on vercel and neon (#33)
Phase 6 Step 6.3: BookRough live at https://bookrough.vercel.app on Vercel (Hobby) and Neon (Free), Frankfurt, with Cloud Run as the fallback. One origin via vercel.json; request logs keep an allowlist of headers; conversion requests wait 30 s; LOG_LEVEL tolerant of case and blanks.

Co-Authored-By: Claude Opus 5.5 <noreply@anthropic.com>
</commit_message>
<xml_diff>
--- a/docs/deployment.docx
+++ b/docs/deployment.docx
@@ -124,7 +124,7 @@
         <w:pStyle w:val="Heading3"/>
       </w:pPr>
       <w:r>
-        <w:t>3. Provider selection — deliberately deferred to Phase 6</w:t>
+        <w:t>3. Provider selection — decided 2026-10-10</w:t>
       </w:r>
     </w:p>
     <w:p>
@@ -132,12 +132,15 @@
         <w:rPr>
           <w:b/>
         </w:rPr>
-        <w:t>No hosting provider has been chosen, and one will not be chosen until Phase 6 is reached.</w:t>
+        <w:t>Chosen on 2026-10-10: Vercel (Hobby) for the frontend and the API, Neon (Free) for Postgres, both in Frankfurt, with Google Cloud Run as the agreed fallback.</w:t>
+      </w:r>
+      <w:r>
+        <w:t xml:space="preserve"> The decision is summarised in §3.6; the measurements, every candidate's terms on that date and the sources are in docs/features/production-deploy.md §3.1.</w:t>
       </w:r>
     </w:p>
     <w:p>
       <w:r>
-        <w:t>This is a deliberate decision, not an oversight. Free-tier terms change frequently — memory allowances, idle-spin-down behaviour, and especially the lifetime of free managed databases. Committing now to terms that may not hold months from now would mean planning against stale facts. The comparison below records the shape of the decision; the actual terms must be re-verified against each provider's current pricing page at the moment the decision is made.</w:t>
+        <w:t>The choice was deferred to Phase 6 on purpose: free-tier terms change frequently — memory allowances, idle spin-down, and especially the lifetime of free managed databases — so they were verified at the moment of deciding rather than months earlier. §3.1–§3.4 record how the decision was framed beforehand.</w:t>
       </w:r>
     </w:p>
     <w:p>
@@ -313,7 +316,7 @@
         <w:pStyle w:val="Heading4"/>
       </w:pPr>
       <w:r>
-        <w:t>3.4. Rule until Phase 6</w:t>
+        <w:t>3.4. Provider-agnostic code (still the rule)</w:t>
       </w:r>
     </w:p>
     <w:p>
@@ -383,7 +386,7 @@
     </w:p>
     <w:p>
       <w:r>
-        <w:t>Written this way, the Phase 6 decision is a configuration change, not a rewrite.</w:t>
+        <w:t>Written this way, the Phase 6 decision was a configuration change, not a rewrite — and moving to the fallback still is.</w:t>
       </w:r>
     </w:p>
     <w:p>
@@ -495,6 +498,126 @@
       </w:r>
       <w:r>
         <w:t xml:space="preserve"> test:docker in main.yml builds the image and runs it against an empty Postgres after every merge and nightly (docs/tests.md §4.2).</w:t>
+      </w:r>
+    </w:p>
+    <w:p>
+      <w:pPr>
+        <w:pStyle w:val="ListBullet"/>
+      </w:pPr>
+      <w:r>
+        <w:rPr>
+          <w:b/>
+        </w:rPr>
+        <w:t>On Vercel:</w:t>
+      </w:r>
+      <w:r>
+        <w:t xml:space="preserve"> the Container Runtime builds this Dockerfile unchanged, as the api service in vercel.json. PORT=4000 is set at the host because the runtime's default is 80; the HEALTHCHECK is ignored there and stays for other hosts and test:docker. Each deployment's image is kept in Vercel's Container Registry.</w:t>
+      </w:r>
+    </w:p>
+    <w:p>
+      <w:pPr>
+        <w:pStyle w:val="Heading4"/>
+      </w:pPr>
+      <w:r>
+        <w:t>3.6. The decision (2026-10-10)</w:t>
+      </w:r>
+    </w:p>
+    <w:p>
+      <w:pPr>
+        <w:pStyle w:val="ListBullet"/>
+      </w:pPr>
+      <w:r>
+        <w:rPr>
+          <w:b/>
+        </w:rPr>
+        <w:t>CPU decided it.</w:t>
+      </w:r>
+      <w:r>
+        <w:t xml:space="preserve"> The production image was timed under each candidate's CPU cap: at 0.1 CPU (Render Free, Koyeb Free) every conversion timed out; at 1 vCPU one conversion took about 3 s and two at once about 7 s.</w:t>
+      </w:r>
+    </w:p>
+    <w:p>
+      <w:pPr>
+        <w:pStyle w:val="ListBullet"/>
+      </w:pPr>
+      <w:r>
+        <w:rPr>
+          <w:b/>
+        </w:rPr>
+        <w:t>Vercel Hobby:</w:t>
+      </w:r>
+      <w:r>
+        <w:t xml:space="preserve"> $0 with no card; 2 GB / 1 vCPU; scales to zero after 5 minutes; 4 hours of active CPU and 360 GB-hours of provisioned memory a month; over quota the project pauses rather than bills. The Container Runtime and Services are Beta. Region fra1.</w:t>
+      </w:r>
+    </w:p>
+    <w:p>
+      <w:pPr>
+        <w:pStyle w:val="ListBullet"/>
+      </w:pPr>
+      <w:r>
+        <w:rPr>
+          <w:b/>
+        </w:rPr>
+        <w:t>One origin:</w:t>
+      </w:r>
+      <w:r>
+        <w:t xml:space="preserve"> https://bookrough.vercel.app — /api/* to the container, everything else to the Vite build (vercel.json). The SameSite=Lax cookie needs no change and CORS is not exercised. *.vercel.app is on the Public Suffix List, so a split api. / web. layout would have broken the cookie.</w:t>
+      </w:r>
+    </w:p>
+    <w:p>
+      <w:pPr>
+        <w:pStyle w:val="ListBullet"/>
+      </w:pPr>
+      <w:r>
+        <w:rPr>
+          <w:b/>
+        </w:rPr>
+        <w:t>Neon Free:</w:t>
+      </w:r>
+      <w:r>
+        <w:t xml:space="preserve"> permanent, no card, Postgres 16 in AWS eu-central-1; branch main for production, branch preview for preview deployments.</w:t>
+      </w:r>
+    </w:p>
+    <w:p>
+      <w:pPr>
+        <w:pStyle w:val="ListBullet"/>
+      </w:pPr>
+      <w:r>
+        <w:rPr>
+          <w:b/>
+        </w:rPr>
+        <w:t>Deploys:</w:t>
+      </w:r>
+      <w:r>
+        <w:t xml:space="preserve"> Vercel's GitHub integration — main to production, other branches to previews. Phase 6's hardening step makes production wait for test:e2e and test:docker (Vercel Deployment Checks).</w:t>
+      </w:r>
+    </w:p>
+    <w:p>
+      <w:pPr>
+        <w:pStyle w:val="ListBullet"/>
+      </w:pPr>
+      <w:r>
+        <w:rPr>
+          <w:b/>
+        </w:rPr>
+        <w:t>Measured in production (2026-10-11):</w:t>
+      </w:r>
+      <w:r>
+        <w:t xml:space="preserve"> a real Spotify → Apple Music conversion in 5.3 s.</w:t>
+      </w:r>
+    </w:p>
+    <w:p>
+      <w:pPr>
+        <w:pStyle w:val="ListBullet"/>
+      </w:pPr>
+      <w:r>
+        <w:rPr>
+          <w:b/>
+        </w:rPr>
+        <w:t>Rejected:</w:t>
+      </w:r>
+      <w:r>
+        <w:t xml:space="preserve"> Render Free and Koyeb Free (0.1 CPU), Render Starter ($7 a month), Fly.io and Railway (no ongoing free tier), Netlify (no containers); the free databases of Render (deleted after 30 days) and Supabase (paused after 7 idle days).</w:t>
       </w:r>
     </w:p>
     <w:p>
@@ -698,9 +821,8 @@
             <w:tcW w:type="dxa" w:w="2880"/>
           </w:tcPr>
           <w:p>
-            <w:r/>
             <w:r>
-              <w:t>Managed Postgres at the chosen provider</w:t>
+              <w:t>Neon Free, Frankfurt, branch main (preview deployments: branch preview)</w:t>
             </w:r>
           </w:p>
         </w:tc>
@@ -808,7 +930,24 @@
         <w:pStyle w:val="ListBullet"/>
       </w:pPr>
       <w:r>
-        <w:t>The Google OAuth client must list the production origin in its authorised JavaScript origins and redirect URIs; this is a manual step in the Google Cloud Console at deploy time and is easy to forget.</w:t>
+        <w:t xml:space="preserve">The Google OAuth client must list the production origin (https://bookrough.vercel.app) under </w:t>
+      </w:r>
+      <w:r>
+        <w:rPr>
+          <w:b/>
+        </w:rPr>
+        <w:t>Authorized JavaScript origins</w:t>
+      </w:r>
+      <w:r>
+        <w:t xml:space="preserve"> — not under redirect URIs, which this sign-in flow does not use; an origin entered there instead produces origin_mismatch. This is a manual step in the Google Cloud Console and is easy to get wrong.</w:t>
+      </w:r>
+    </w:p>
+    <w:p>
+      <w:pPr>
+        <w:pStyle w:val="ListBullet"/>
+      </w:pPr>
+      <w:r>
+        <w:t>Production variables are set in Vercel per environment: DATABASE_URL and JWT_SECRET (secrets, different for Production and Preview), GOOGLE_CLIENT_ID, VITE_GOOGLE_CLIENT_ID, CORS_ORIGIN, PORT=4000, LOG_LEVEL=info (lowercase). Never E2E_GOOGLE_PUBLIC_KEY or E2E_SCRAPER_FIXTURES. The full table is in docs/features/production-deploy.md §3.6.</w:t>
       </w:r>
     </w:p>
     <w:p>
@@ -1182,7 +1321,7 @@
         <w:pStyle w:val="ListBullet"/>
       </w:pPr>
       <w:r>
-        <w:t>[ ] Provider chosen, with current free-tier terms verified and recorded in this document.</w:t>
+        <w:t>[x] Provider chosen, with current free-tier terms verified and recorded in this document (§3.6, 2026-10-10).</w:t>
       </w:r>
     </w:p>
     <w:p>
@@ -1190,18 +1329,7 @@
         <w:pStyle w:val="ListBullet"/>
       </w:pPr>
       <w:r>
-        <w:t xml:space="preserve">[ ] Production Postgres provisioned; </w:t>
-      </w:r>
-      <w:r>
-        <w:rPr>
-          <w:rFonts w:ascii="Consolas" w:hAnsi="Consolas"/>
-          <w:color w:val="A03030"/>
-          <w:sz w:val="19"/>
-        </w:rPr>
-        <w:t>DATABASE_URL</w:t>
-      </w:r>
-      <w:r>
-        <w:t xml:space="preserve"> set as a secret.</w:t>
+        <w:t>[x] Production Postgres provisioned; DATABASE_URL set as a secret.</w:t>
       </w:r>
     </w:p>
     <w:p>
@@ -1209,7 +1337,7 @@
         <w:pStyle w:val="ListBullet"/>
       </w:pPr>
       <w:r>
-        <w:t xml:space="preserve">[ ] Prisma migrations run against production — automatic: the container runs prisma migrate deploy on start (§3.5).</w:t>
+        <w:t>[x] Prisma migrations run against production — automatic: the container runs prisma migrate deploy on start (§3.5).</w:t>
       </w:r>
     </w:p>
     <w:p>
@@ -1217,18 +1345,7 @@
         <w:pStyle w:val="ListBullet"/>
       </w:pPr>
       <w:r>
-        <w:t xml:space="preserve">[ ] </w:t>
-      </w:r>
-      <w:r>
-        <w:rPr>
-          <w:rFonts w:ascii="Consolas" w:hAnsi="Consolas"/>
-          <w:color w:val="A03030"/>
-          <w:sz w:val="19"/>
-        </w:rPr>
-        <w:t>JWT_SECRET</w:t>
-      </w:r>
-      <w:r>
-        <w:t xml:space="preserve"> independently generated and set.</w:t>
+        <w:t>[x] JWT_SECRET independently generated and set.</w:t>
       </w:r>
     </w:p>
     <w:p>
@@ -1236,7 +1353,7 @@
         <w:pStyle w:val="ListBullet"/>
       </w:pPr>
       <w:r>
-        <w:t>[ ] Google OAuth client updated with the production origin and redirect URI.</w:t>
+        <w:t>[x] Google OAuth client updated with the production origin (JavaScript origins only, §5).</w:t>
       </w:r>
     </w:p>
     <w:p>
@@ -1244,18 +1361,7 @@
         <w:pStyle w:val="ListBullet"/>
       </w:pPr>
       <w:r>
-        <w:t xml:space="preserve">[ ] Backend deployed from the Playwright-based Docker image; </w:t>
-      </w:r>
-      <w:r>
-        <w:rPr>
-          <w:rFonts w:ascii="Consolas" w:hAnsi="Consolas"/>
-          <w:color w:val="A03030"/>
-          <w:sz w:val="19"/>
-        </w:rPr>
-        <w:t>/api/health</w:t>
-      </w:r>
-      <w:r>
-        <w:t xml:space="preserve"> returns 200 over HTTPS.</w:t>
+        <w:t>[x] Backend deployed from the Playwright-based Docker image; /api/health returns 200 over HTTPS.</w:t>
       </w:r>
     </w:p>
     <w:p>
@@ -1263,18 +1369,7 @@
         <w:pStyle w:val="ListBullet"/>
       </w:pPr>
       <w:r>
-        <w:t xml:space="preserve">[ ] Frontend built with the production </w:t>
-      </w:r>
-      <w:r>
-        <w:rPr>
-          <w:rFonts w:ascii="Consolas" w:hAnsi="Consolas"/>
-          <w:color w:val="A03030"/>
-          <w:sz w:val="19"/>
-        </w:rPr>
-        <w:t>VITE_API_BASE_URL</w:t>
-      </w:r>
-      <w:r>
-        <w:t xml:space="preserve"> and deployed.</w:t>
+        <w:t>[x] Frontend built and deployed on the same origin; production builds default the API base URL to /api.</w:t>
       </w:r>
     </w:p>
     <w:p>
@@ -1282,7 +1377,7 @@
         <w:pStyle w:val="ListBullet"/>
       </w:pPr>
       <w:r>
-        <w:t>[ ] CORS configured to allow exactly the production frontend origin — not a wildcard.</w:t>
+        <w:t>[x] CORS configured to allow exactly the production origin — not a wildcard (unused in practice: every call is same-origin).</w:t>
       </w:r>
     </w:p>
     <w:p>
@@ -1290,40 +1385,7 @@
         <w:pStyle w:val="ListBullet"/>
       </w:pPr>
       <w:r>
-        <w:t xml:space="preserve">[ ] Auth cookie verified as </w:t>
-      </w:r>
-      <w:r>
-        <w:rPr>
-          <w:rFonts w:ascii="Consolas" w:hAnsi="Consolas"/>
-          <w:color w:val="A03030"/>
-          <w:sz w:val="19"/>
-        </w:rPr>
-        <w:t>HttpOnly</w:t>
-      </w:r>
-      <w:r>
-        <w:t xml:space="preserve">, </w:t>
-      </w:r>
-      <w:r>
-        <w:rPr>
-          <w:rFonts w:ascii="Consolas" w:hAnsi="Consolas"/>
-          <w:color w:val="A03030"/>
-          <w:sz w:val="19"/>
-        </w:rPr>
-        <w:t>Secure</w:t>
-      </w:r>
-      <w:r>
-        <w:t xml:space="preserve">, and </w:t>
-      </w:r>
-      <w:r>
-        <w:rPr>
-          <w:rFonts w:ascii="Consolas" w:hAnsi="Consolas"/>
-          <w:color w:val="A03030"/>
-          <w:sz w:val="19"/>
-        </w:rPr>
-        <w:t>SameSite</w:t>
-      </w:r>
-      <w:r>
-        <w:t>=Lax, which requires the frontend and the API on the same site (one registrable domain, or the API proxied under the frontend origin). See docs/features/google-auth.md §4.</w:t>
+        <w:t>[x] Auth cookie verified as HttpOnly, Secure, and SameSite=Lax in production (2026-10-11) — possible because the frontend and the API share one origin (§3.6). See docs/features/google-auth.md §4.</w:t>
       </w:r>
     </w:p>
     <w:p>
@@ -1331,7 +1393,7 @@
         <w:pStyle w:val="ListBullet"/>
       </w:pPr>
       <w:r>
-        <w:t>[ ] Link conversion verified end-to-end in production — this is the step most likely to fail, because Chromium's memory footprint on a small instance is not reproducible locally.</w:t>
+        <w:t>[x] Link conversion verified end-to-end in production — the step most likely to fail; it converted in 5.3 s on 2026-10-11.</w:t>
       </w:r>
     </w:p>
     <w:p>

</xml_diff>

<commit_message>
test(pwa): install hint, manifest and index.html contracts, step 6.1
Stage 4 of Step 6.1 (docs/features/pwa-installable.md §7): unit tests for
lib/installHint, component tests for InstallHint, the hint on Welcome and
the invite preview, a contract test for the manifest, the icons and the
iOS tags in index.html, and the vercel.json rule that serves them as
files. Docs: deployment, frontend screens and tech stack (.md + .docx),
google-auth.md §8 resolved, DEVELOPMENT.md Step 6.1, and vite-plugin-pwa
moved to Step 6.2.

Co-Authored-By: Claude Opus 5.5 <noreply@anthropic.com>
</commit_message>
<xml_diff>
--- a/docs/deployment.docx
+++ b/docs/deployment.docx
@@ -1116,6 +1116,102 @@
     </w:p>
     <w:p>
       <w:pPr>
+        <w:pStyle w:val="ListBullet"/>
+      </w:pPr>
+      <w:r>
+        <w:rPr>
+          <w:b/>
+        </w:rPr>
+        <w:t>Built in Step 6.1 as static files:</w:t>
+      </w:r>
+      <w:r>
+        <w:t xml:space="preserve"> </w:t>
+      </w:r>
+      <w:r>
+        <w:rPr>
+          <w:rFonts w:ascii="Consolas" w:hAnsi="Consolas"/>
+        </w:rPr>
+        <w:t>frontend/public/manifest.webmanifest</w:t>
+      </w:r>
+      <w:r>
+        <w:t xml:space="preserve"> and an icon set rendered once from </w:t>
+      </w:r>
+      <w:r>
+        <w:rPr>
+          <w:rFonts w:ascii="Consolas" w:hAnsi="Consolas"/>
+        </w:rPr>
+        <w:t>icons/icon.svg</w:t>
+      </w:r>
+      <w:r>
+        <w:t xml:space="preserve">, with no service worker. </w:t>
+      </w:r>
+      <w:r>
+        <w:rPr>
+          <w:rFonts w:ascii="Consolas" w:hAnsi="Consolas"/>
+        </w:rPr>
+        <w:t>vite-plugin-pwa</w:t>
+      </w:r>
+      <w:r>
+        <w:t xml:space="preserve"> arrives in Step 6.2 and reuses the same manifest file (</w:t>
+      </w:r>
+      <w:r>
+        <w:rPr>
+          <w:rFonts w:ascii="Consolas" w:hAnsi="Consolas"/>
+        </w:rPr>
+        <w:t>docs/features/pwa-installable.md</w:t>
+      </w:r>
+      <w:r>
+        <w:t xml:space="preserve"> §3).</w:t>
+      </w:r>
+    </w:p>
+    <w:p>
+      <w:pPr>
+        <w:pStyle w:val="ListBullet"/>
+      </w:pPr>
+      <w:r>
+        <w:rPr>
+          <w:b/>
+        </w:rPr>
+        <w:t>Install hint:</w:t>
+      </w:r>
+      <w:r>
+        <w:t xml:space="preserve"> iOS has no install prompt, and in iOS 26 Safari, Share sits under the ••• menu. iPhone and iPad visitors therefore see a dismissible hint on Welcome and the invite preview — never inside the installed app or in apps' in-app browsers (</w:t>
+      </w:r>
+      <w:r>
+        <w:rPr>
+          <w:rFonts w:ascii="Consolas" w:hAnsi="Consolas"/>
+        </w:rPr>
+        <w:t>docs/features/pwa-installable.md</w:t>
+      </w:r>
+      <w:r>
+        <w:t xml:space="preserve"> §5.1).</w:t>
+      </w:r>
+    </w:p>
+    <w:p>
+      <w:pPr>
+        <w:pStyle w:val="ListBullet"/>
+      </w:pPr>
+      <w:r>
+        <w:rPr>
+          <w:b/>
+        </w:rPr>
+        <w:t>Testing an install before merge</w:t>
+      </w:r>
+      <w:r>
+        <w:t xml:space="preserve"> happens on the branch preview: Vercel Authentication switched off for the test and the preview's address under the OAuth client's JavaScript origins. Google's popup sign-in was confirmed to work inside the installed app on iOS 26 (</w:t>
+      </w:r>
+      <w:r>
+        <w:rPr>
+          <w:rFonts w:ascii="Consolas" w:hAnsi="Consolas"/>
+        </w:rPr>
+        <w:t>docs/features/pwa-installable.md</w:t>
+      </w:r>
+      <w:r>
+        <w:t xml:space="preserve"> §3.4).</w:t>
+      </w:r>
+    </w:p>
+    <w:p>
+      <w:pPr>
         <w:pStyle w:val="Heading4"/>
       </w:pPr>
       <w:r>

</xml_diff>

<commit_message>
feat(pwa): installable pwa with an ios install hint, step 6.1 (#34)
Step 6.1 (docs/features/pwa-installable.md): static manifest and placeholder icons with no new dependency, iOS meta tags, an iOS-only install hint on Welcome and the invite preview, and DismissibleBar / deviceStorage shared with the announcement. Verified on a real iPhone (iOS 26) on the branch preview, including Google sign-in inside the installed app.

Co-Authored-By: Claude Opus 5.5 <noreply@anthropic.com>
</commit_message>
<xml_diff>
--- a/docs/deployment.docx
+++ b/docs/deployment.docx
@@ -1116,6 +1116,102 @@
     </w:p>
     <w:p>
       <w:pPr>
+        <w:pStyle w:val="ListBullet"/>
+      </w:pPr>
+      <w:r>
+        <w:rPr>
+          <w:b/>
+        </w:rPr>
+        <w:t>Built in Step 6.1 as static files:</w:t>
+      </w:r>
+      <w:r>
+        <w:t xml:space="preserve"> </w:t>
+      </w:r>
+      <w:r>
+        <w:rPr>
+          <w:rFonts w:ascii="Consolas" w:hAnsi="Consolas"/>
+        </w:rPr>
+        <w:t>frontend/public/manifest.webmanifest</w:t>
+      </w:r>
+      <w:r>
+        <w:t xml:space="preserve"> and an icon set rendered once from </w:t>
+      </w:r>
+      <w:r>
+        <w:rPr>
+          <w:rFonts w:ascii="Consolas" w:hAnsi="Consolas"/>
+        </w:rPr>
+        <w:t>icons/icon.svg</w:t>
+      </w:r>
+      <w:r>
+        <w:t xml:space="preserve">, with no service worker. </w:t>
+      </w:r>
+      <w:r>
+        <w:rPr>
+          <w:rFonts w:ascii="Consolas" w:hAnsi="Consolas"/>
+        </w:rPr>
+        <w:t>vite-plugin-pwa</w:t>
+      </w:r>
+      <w:r>
+        <w:t xml:space="preserve"> arrives in Step 6.2 and reuses the same manifest file (</w:t>
+      </w:r>
+      <w:r>
+        <w:rPr>
+          <w:rFonts w:ascii="Consolas" w:hAnsi="Consolas"/>
+        </w:rPr>
+        <w:t>docs/features/pwa-installable.md</w:t>
+      </w:r>
+      <w:r>
+        <w:t xml:space="preserve"> §3).</w:t>
+      </w:r>
+    </w:p>
+    <w:p>
+      <w:pPr>
+        <w:pStyle w:val="ListBullet"/>
+      </w:pPr>
+      <w:r>
+        <w:rPr>
+          <w:b/>
+        </w:rPr>
+        <w:t>Install hint:</w:t>
+      </w:r>
+      <w:r>
+        <w:t xml:space="preserve"> iOS has no install prompt, and in iOS 26 Safari, Share sits under the ••• menu. iPhone and iPad visitors therefore see a dismissible hint on Welcome and the invite preview — never inside the installed app or in apps' in-app browsers (</w:t>
+      </w:r>
+      <w:r>
+        <w:rPr>
+          <w:rFonts w:ascii="Consolas" w:hAnsi="Consolas"/>
+        </w:rPr>
+        <w:t>docs/features/pwa-installable.md</w:t>
+      </w:r>
+      <w:r>
+        <w:t xml:space="preserve"> §5.1).</w:t>
+      </w:r>
+    </w:p>
+    <w:p>
+      <w:pPr>
+        <w:pStyle w:val="ListBullet"/>
+      </w:pPr>
+      <w:r>
+        <w:rPr>
+          <w:b/>
+        </w:rPr>
+        <w:t>Testing an install before merge</w:t>
+      </w:r>
+      <w:r>
+        <w:t xml:space="preserve"> happens on the branch preview: Vercel Authentication switched off for the test and the preview's address under the OAuth client's JavaScript origins. Google's popup sign-in was confirmed to work inside the installed app on iOS 26 (</w:t>
+      </w:r>
+      <w:r>
+        <w:rPr>
+          <w:rFonts w:ascii="Consolas" w:hAnsi="Consolas"/>
+        </w:rPr>
+        <w:t>docs/features/pwa-installable.md</w:t>
+      </w:r>
+      <w:r>
+        <w:t xml:space="preserve"> §3.4).</w:t>
+      </w:r>
+    </w:p>
+    <w:p>
+      <w:pPr>
         <w:pStyle w:val="Heading4"/>
       </w:pPr>
       <w:r>

</xml_diff>

<commit_message>
chore(deploy): slim backend image and opt-in previews for vercel storage
Vercel's Hobby team hit 75% of its 10 GB deployment storage: every kept
deployment holds a 3.12 GB backend image. The image now builds on
node:24.21.0-bookworm-slim with only Chromium's headless shell (1.17 GB),
only main deploys unless a branch opts in by name, and test:docker launches
Chromium inside the image. Spec: docs/features/deployment-storage.md.

Co-Authored-By: Claude Opus 5.5 <noreply@anthropic.com>
</commit_message>
<xml_diff>
--- a/docs/deployment.docx
+++ b/docs/deployment.docx
@@ -413,7 +413,7 @@
         <w:t xml:space="preserve">Build:</w:t>
       </w:r>
       <w:r>
-        <w:t xml:space="preserve"> docker build -t bookrough-api backend. Base mcr.microsoft.com/playwright:v1.63.0-noble (Ubuntu 24.04, Node 24, Chromium pinned to our Playwright); a multi-stage build whose runtime stage holds production dependencies, dist/ and the Prisma migrations only.</w:t>
+        <w:t xml:space="preserve"> docker build -t bookrough-api backend. Base node:24.21.0-bookworm-slim (Debian 12, Node 24) with only Chromium's headless shell and its system libraries, installed by the playwright package in the lockfile, so the browser always matches the library; a multi-stage build whose runtime stage holds production dependencies, dist/ and the Prisma migrations only.</w:t>
       </w:r>
     </w:p>
     <w:p>
@@ -455,7 +455,7 @@
         <w:t xml:space="preserve">Process:</w:t>
       </w:r>
       <w:r>
-        <w:t xml:space="preserve"> runs as the non-root pwuser, with tini as PID 1 so SIGTERM reaches Node (graceful shutdown) and orphaned Chromium processes are reaped — no --init flag needed from the host. --disable-dev-shm-usage means --ipc=host is not needed either.</w:t>
+        <w:t xml:space="preserve"> runs as the non-root node user, with tini as PID 1 so SIGTERM reaches Node (graceful shutdown) and orphaned Chromium processes are reaped — no --init flag needed from the host. --disable-dev-shm-usage means --ipc=host is not needed either.</w:t>
       </w:r>
     </w:p>
     <w:p>
@@ -483,7 +483,7 @@
         <w:t xml:space="preserve">Measured (Docker Desktop, 2026-10-05):</w:t>
       </w:r>
       <w:r>
-        <w:t xml:space="preserve"> image 2.85 GB (2.51 GB of it the base, which also carries unused Firefox and WebKit); about 83 MB of memory idle and about 234 MB at the peak of one real conversion. A 512 MB instance looks workable with p-limit(2); verify under load in Phase 6.</w:t>
+        <w:t xml:space="preserve"> image 2.85 GB (2.51 GB of it the base, which also carries unused Firefox and WebKit); about 83 MB of memory idle and about 234 MB at the peak of one real conversion. A 512 MB instance looks workable with p-limit(2); verify under load in Phase 6. Slimmed on 2026-10-11 to 1.17 GB (the browser and its libraries 589 MB, production node_modules 345 MB); a real conversion in 2.4 s and about 114 MB of memory afterwards (docs/features/deployment-storage.md).</w:t>
       </w:r>
     </w:p>
     <w:p>
@@ -497,7 +497,7 @@
         <w:t xml:space="preserve">CI:</w:t>
       </w:r>
       <w:r>
-        <w:t xml:space="preserve"> test:docker in main.yml builds the image and runs it against an empty Postgres after every merge and nightly (docs/tests.md §4.2).</w:t>
+        <w:t xml:space="preserve"> test:docker in main.yml builds the image and runs it against an empty Postgres, launching Chromium inside it, after every merge and nightly (docs/tests.md §4.2).</w:t>
       </w:r>
     </w:p>
     <w:p>
@@ -511,7 +511,7 @@
         <w:t>On Vercel:</w:t>
       </w:r>
       <w:r>
-        <w:t xml:space="preserve"> the Container Runtime builds this Dockerfile unchanged, as the api service in vercel.json. PORT=4000 is set at the host because the runtime's default is 80; the HEALTHCHECK is ignored there and stays for other hosts and test:docker. Each deployment's image is kept in Vercel's Container Registry.</w:t>
+        <w:t xml:space="preserve"> the Container Runtime builds this Dockerfile unchanged, as the api service in vercel.json. PORT=4000 is set at the host because the runtime's default is 80; the HEALTHCHECK is ignored there and stays for other hosts and test:docker. Each deployment's image is kept in Vercel's Container Registry and counts toward the Hobby team's 10 GB of deployment storage — the reason the image is kept small and previews are opt-in (docs/features/deployment-storage.md).</w:t>
       </w:r>
     </w:p>
     <w:p>
@@ -589,7 +589,7 @@
         <w:t>Deploys:</w:t>
       </w:r>
       <w:r>
-        <w:t xml:space="preserve"> Vercel's GitHub integration — main to production, other branches to previews. Phase 6's hardening step makes production wait for test:e2e and test:docker (Vercel Deployment Checks).</w:t>
+        <w:t xml:space="preserve"> Vercel's GitHub integration — main to production; another branch builds a preview only when it opts in by its exact name in vercel.json (git.deploymentEnabled), because every deployment stores a backend image (docs/features/deployment-storage.md). Phase 6's hardening step makes production wait for test:e2e and test:docker (Vercel Deployment Checks).</w:t>
       </w:r>
     </w:p>
     <w:p>

</xml_diff>